<commit_message>
docs: clarify 7 discovery scanners and 6 property graph nodes in synopsis
</commit_message>
<xml_diff>
--- a/docs/AGILEGRAPH_PROJECT_SYNOPSIS.docx
+++ b/docs/AGILEGRAPH_PROJECT_SYNOPSIS.docx
@@ -180,7 +180,7 @@
       <w:r>
         <w:t>The primary objectives of the proposed AgileGraph project are:</w:t>
         <w:br/>
-        <w:t>1. Multi-Language Cryptographic Discovery: To build static AST and pattern scanners capable of parsing and extracting cryptographic algorithms, key lengths, cipher modes, digital certificates, and network endpoints across Python, Java, Go, and dependency manifests (requirements.txt, pom.xml, go.mod).</w:t>
+        <w:t>1. Comprehensive 7-Scanner Discovery Suite: To build a deterministic static discovery engine comprising 7 specialized scanners across 3 programming languages (Python AST, Java JCA/JCE, Go) and 4 structural/environmental analyzers (Dependency Manifests with OSV CVE intelligence, X.509 Certificate &amp; Key parser, Network Endpoint scanner, and Sensitive Data/Secret scanner).</w:t>
         <w:br/>
         <w:t>2. Formal Typed Property Graph Modeling: To design and construct an in-memory 6-node typed property graph (File, CryptoUsage, Certificate, Endpoint, Library, SensitiveData) interconnected by 7 canonical directed relationships (CONTAINS, IMPORTS, DEPENDS_ON, CALLS, EXPOSES, PROTECTS, USES_CERT).</w:t>
         <w:br/>
@@ -1029,7 +1029,7 @@
       <w:r>
         <w:t>The proposed AgileGraph architecture operates through five cohesive technical layers:</w:t>
         <w:br/>
-        <w:t>1. Multi-Language Discovery: Employs Python native AST visitors, Java regex/AST parsers for JCA/JCE primitives, and Go AST matching for standard and third-party crypto packages. Manifest scanners extract dependency trees and enrich findings with local OSV CVE intelligence.</w:t>
+        <w:t>1. Comprehensive 7-Scanner Discovery Suite: Executes 7 specialized static scanners mapping directly into the 6 property-graph node categories: (a) Python AST Scanner (hashlib, hmac, cryptography.hazmat, PyCryptodome), (b) Java Scanner (JCA/JCE Cipher, KeyPairGenerator, jjwt, java-jwt), (c) Go Scanner (crypto/*, golang-jwt), (d) Dependency Manifest Scanner (requirements.txt, pom.xml, go.mod with local OSV CVE cache), (e) Certificate &amp; Key Scanner (X.509 RFC 5280 parsing, inline PEM blocks, private keys), (f) Network Endpoint Scanner (service bindings, port configurations, route decorators), and (g) Sensitive Data Scanner (Shannon entropy calculation, secret tokens, private credentials).</w:t>
         <w:br/>
         <w:t>2. 6-Node Typed Property Graph: Models software architecture in NetworkX across File, CryptoUsage, Certificate, Endpoint, Library, and SensitiveData nodes interconnected by 7 canonical relations (CONTAINS, IMPORTS, DEPENDS_ON, CALLS, EXPOSES, PROTECTS, USES_CERT).</w:t>
         <w:br/>
@@ -1122,7 +1122,7 @@
     </w:p>
     <w:p>
       <w:r>
-        <w:t>1. Automated Polyglot Scanner: A deterministic CLI and background worker scanning Python, Java, and Go repositories.</w:t>
+        <w:t>1. Automated Polyglot 7-Scanner Suite: A deterministic CLI and background worker executing 7 specialized scanners across Python, Java, Go, package manifests, certificates, endpoints, and secrets.</w:t>
         <w:br/>
         <w:t>2. Interactive Web Dashboard: A full-stack application featuring 2D force-directed graph visualization, inventory ledgers, and Mosca calculators.</w:t>
         <w:br/>

</xml_diff>

<commit_message>
docs: align synopsis claims and references with verified codebase and published literature
</commit_message>
<xml_diff>
--- a/docs/AGILEGRAPH_PROJECT_SYNOPSIS.docx
+++ b/docs/AGILEGRAPH_PROJECT_SYNOPSIS.docx
@@ -124,7 +124,7 @@
     </w:p>
     <w:p>
       <w:r>
-        <w:t>The advent of Cryptanalytically Relevant Quantum Computers (CRQCs) presents an existential threat to modern asymmetric cryptography. Shor’s algorithm guarantees that quantum computing operating in polynomial time can compromise public-key cryptosystems based on integer factorization (RSA) and discrete logarithms over finite fields and elliptic curves (DSA, ECDSA, ECDH). In response, the National Institute of Standards and Technology (NIST) finalized the primary post-quantum cryptographic standards in August 2024: FIPS 203 (ML-KEM), FIPS 204 (ML-DSA), and FIPS 205 (SLH-DSA).</w:t>
+        <w:t>The advent of Cryptanalytically Relevant Quantum Computers (CRQCs) presents an existential threat to modern asymmetric cryptography. Shor’s algorithm shows that a cryptanalytically relevant quantum computer operating in polynomial time can compromise public-key cryptosystems based on integer factorization (RSA) and discrete logarithms over finite fields and elliptic curves (DSA, ECDSA, ECDH). In response, the National Institute of Standards and Technology (NIST) finalized the primary post-quantum cryptographic standards in August 2024: FIPS 203 (ML-KEM), FIPS 204 (ML-DSA), and FIPS 205 (SLH-DSA).</w:t>
       </w:r>
     </w:p>
     <w:p>
@@ -134,7 +134,7 @@
     </w:p>
     <w:p>
       <w:r>
-        <w:t>AgileGraph is proposed as an automated cryptographic discovery, typed property-graph modeling, and crypto-agility risk scoring system. Rather than treating codebases as flat lists of dependencies, AgileGraph structures polyglot source code (Python, Java, Go), dependency manifests, and infrastructure endpoints into a formal 6-node typed property graph. It evaluates migration urgency through Michele Mosca’s Theorem (U = (x+y)/z), computes deterministic 7-factor heuristic risk scores with missing-context handling, tracks asset remediation across a 6-state lifecycle, and investigates a Heterogeneous Graph Attention Network (GATv2) for topological risk propagation and representation distillation.</w:t>
+        <w:t>AgileGraph is proposed as an automated cryptographic discovery, typed property-graph modeling, and crypto-agility risk scoring system. Rather than treating codebases as flat lists of dependencies, AgileGraph structures polyglot source code (Python, Java, Go), dependency manifests, and infrastructure endpoints into a formal 6-node typed property graph. It evaluates migration urgency through Michele Mosca’s Theorem (U = (x+y)/z), computes deterministic 7-factor heuristic risk scores with missing-context handling, tracks asset remediation across a 6-state lifecycle roadmap, and investigates a Heterogeneous Graph Attention Network (GATv2) for topological risk propagation and representation distillation.</w:t>
       </w:r>
     </w:p>
     <w:p>
@@ -188,9 +188,9 @@
         <w:br/>
         <w:t>4. Mosca Urgency &amp; 4-Tier Triage Matrix: To quantify post-quantum migration urgency (U = (x+y)/z) against quantum threat horizons and assign cryptographic assets into actionable triage bands (CRITICAL, HIGH, MEDIUM, LOW).</w:t>
         <w:br/>
-        <w:t>5. Heterogeneous Graph Neural Network (GATv2) Integration: To evaluate a PyG Heterogeneous GATv2 model to explore graph representation learning and structural risk propagation across code property graphs under Leave-One-Project-Out (LOPO) cross-validation.</w:t>
+        <w:t>5. Heterogeneous Graph Neural Network (GATv2) Representation Distillation: To evaluate a PyG Heterogeneous GATv2 model trained on weak labels derived from the deterministic heuristic risk engine to explore topological representation distillation across code property graphs under Leave-One-Project-Out (LOPO) cross-validation (evaluating representation learning rather than claiming independent prediction of unverified real-world cryptanalytic risk).</w:t>
         <w:br/>
-        <w:t>6. 6-State Remediation Lifecycle &amp; Interactive Dashboard: To deliver an enterprise-grade React/TypeScript web dashboard and REST API backed by an append-only audit trail tracking assets across 6 lifecycle states (DISCOVERED -&gt; EVALUATED -&gt; IN_PLANNING -&gt; IN_MIGRATION -&gt; VALIDATED -&gt; DECOMMISSIONED).</w:t>
+        <w:t>6. 6-State Remediation Lifecycle &amp; Interactive Dashboard: To deliver an enterprise-grade React/TypeScript web dashboard and REST API backed by an append-only audit trail tracking assets across a 6-state migration roadmap (DISCOVERED -&gt; EVALUATED -&gt; IN_PLANNING -&gt; IN_MIGRATION -&gt; VALIDATED -&gt; DECOMMISSIONED).</w:t>
       </w:r>
     </w:p>
     <w:p>
@@ -221,7 +221,7 @@
     </w:p>
     <w:p>
       <w:r>
-        <w:t>Existing enterprise crypto-inventory mechanisms typically rely on basic static analysis (SAST) linters (e.g., Bandit for Python, SpotBugs/FindSecBugs for Java) or commercial SCA tools (e.g., Snyk, Mend). These tools execute regex-based or token-based searches to flag deprecated algorithm names (such as MD5, SHA-1, or DES). Recently, cryptographic bill of materials (CBOM) generators have emerged to catalog cryptographic libraries declared in software build manifests.</w:t>
+        <w:t>Existing enterprise crypto-inventory mechanisms typically rely on basic static analysis (SAST) linters (e.g., Bandit for Python, SpotBugs/FindSecBugs for Java) or commercial SCA tools (e.g., Snyk, Mend). These tools execute regex-based or token-based searches to flag deprecated algorithm names (such as MD5, SHA-1, or DES). Recently, cryptographic bill of materials (CBOM) standards (e.g., OWASP CycloneDX) have emerged to catalog cryptographic libraries declared in software build manifests.</w:t>
       </w:r>
     </w:p>
     <w:p>
@@ -441,7 +441,7 @@
               <w:rPr>
                 <w:sz w:val="19"/>
               </w:rPr>
-              <w:t>Transitioning to Post-Quantum Cryptography (IEEE S&amp;P)</w:t>
+              <w:t>Cybersecurity in an Era with Quantum Computers: Will We Be Ready? (IEEE Security &amp; Privacy)</w:t>
             </w:r>
           </w:p>
         </w:tc>
@@ -465,7 +465,7 @@
               <w:rPr>
                 <w:sz w:val="19"/>
               </w:rPr>
-              <w:t>M. Mosca (2022)</w:t>
+              <w:t>M. Mosca (2018)</w:t>
             </w:r>
           </w:p>
         </w:tc>
@@ -489,7 +489,7 @@
               <w:rPr>
                 <w:sz w:val="19"/>
               </w:rPr>
-              <w:t>Formulated Mosca’s theorem (x+y &gt; z) defining quantum migration deadlines.</w:t>
+              <w:t>Formulated Mosca’s inequality (x+y &gt; z) defining quantum migration deadlines and shelf-life urgency.</w:t>
             </w:r>
           </w:p>
         </w:tc>
@@ -513,7 +513,7 @@
               <w:rPr>
                 <w:sz w:val="19"/>
               </w:rPr>
-              <w:t>Lacks an automated static analysis engine to extract x, y, and code-level parameters.</w:t>
+              <w:t>Lacks an automated static analysis engine to extract x, y, and code-level vulnerability parameters.</w:t>
             </w:r>
           </w:p>
         </w:tc>
@@ -563,7 +563,7 @@
               <w:rPr>
                 <w:sz w:val="19"/>
               </w:rPr>
-              <w:t>SoK: Cryptographic Agility in Practice (EuroS&amp;P)</w:t>
+              <w:t>Migration to Post-Quantum Cryptography: Cryptographic Discovery (NIST SP 1800-38B)</w:t>
             </w:r>
           </w:p>
         </w:tc>
@@ -587,7 +587,7 @@
               <w:rPr>
                 <w:sz w:val="19"/>
               </w:rPr>
-              <w:t>K. A. et al. (2023)</w:t>
+              <w:t>NIST NCCoE (2023)</w:t>
             </w:r>
           </w:p>
         </w:tc>
@@ -611,7 +611,7 @@
               <w:rPr>
                 <w:sz w:val="19"/>
               </w:rPr>
-              <w:t>Analyzed enterprise agility bottlenecks and defined crypto-agility dimensions.</w:t>
+              <w:t>Outlined architectural guidelines and discovery requirements for finding quantum-vulnerable cryptography.</w:t>
             </w:r>
           </w:p>
         </w:tc>
@@ -635,7 +635,7 @@
               <w:rPr>
                 <w:sz w:val="19"/>
               </w:rPr>
-              <w:t>Provided theoretical taxonomies without graph-based static vulnerability modeling.</w:t>
+              <w:t>Defines organizational guidance without providing a formal typed property graph model or structural risk engine.</w:t>
             </w:r>
           </w:p>
         </w:tc>
@@ -685,7 +685,7 @@
               <w:rPr>
                 <w:sz w:val="19"/>
               </w:rPr>
-              <w:t>How Do Open-Source Projects Migrate to PQC? (ACM TOSEM)</w:t>
+              <w:t>An Empirical Study of Cryptographic Misuse in Software Applications (ACM CCS)</w:t>
             </w:r>
           </w:p>
         </w:tc>
@@ -709,7 +709,7 @@
               <w:rPr>
                 <w:sz w:val="19"/>
               </w:rPr>
-              <w:t>X. Chen et al. (2024)</w:t>
+              <w:t>M. Egele et al. (2013)</w:t>
             </w:r>
           </w:p>
         </w:tc>
@@ -733,7 +733,7 @@
               <w:rPr>
                 <w:sz w:val="19"/>
               </w:rPr>
-              <w:t>Empirical audit of PQC migration patterns and hybrid cryptosystem adoption.</w:t>
+              <w:t>Demonstrated automated static analysis rules for detecting cryptographic API misuse across software.</w:t>
             </w:r>
           </w:p>
         </w:tc>
@@ -757,7 +757,7 @@
               <w:rPr>
                 <w:sz w:val="19"/>
               </w:rPr>
-              <w:t>Highlighted developer errors in PQC migration; lacked automated risk scoring tools.</w:t>
+              <w:t>Focuses on classical API misuses without evaluating post-quantum threat horizons or multi-layer property graph dependencies.</w:t>
             </w:r>
           </w:p>
         </w:tc>
@@ -855,7 +855,7 @@
               <w:rPr>
                 <w:sz w:val="19"/>
               </w:rPr>
-              <w:t>Proved dynamic attention limitations in standard GAT and introduced GATv2.</w:t>
+              <w:t>Proved dynamic attention limitations in standard GAT and introduced GATv2 with strictly dynamic attention.</w:t>
             </w:r>
           </w:p>
         </w:tc>
@@ -879,7 +879,7 @@
               <w:rPr>
                 <w:sz w:val="19"/>
               </w:rPr>
-              <w:t>GATv2 evaluated only on citation graphs, not on heterogeneous code security graphs.</w:t>
+              <w:t>Evaluated only on citation and synthetic benchmark graphs, not on heterogeneous code security dependency graphs.</w:t>
             </w:r>
           </w:p>
         </w:tc>
@@ -929,7 +929,7 @@
               <w:rPr>
                 <w:sz w:val="19"/>
               </w:rPr>
-              <w:t>Automated Cryptographic Discovery in ASTs (Comp &amp; Sec)</w:t>
+              <w:t>CogniCrypt: Supporting Developers in using Cryptography (IEEE/ACM ASE)</w:t>
             </w:r>
           </w:p>
         </w:tc>
@@ -953,7 +953,7 @@
               <w:rPr>
                 <w:sz w:val="19"/>
               </w:rPr>
-              <w:t>R. Kumar et al. (2023)</w:t>
+              <w:t>S. Krüger et al. (2017)</w:t>
             </w:r>
           </w:p>
         </w:tc>
@@ -977,7 +977,7 @@
               <w:rPr>
                 <w:sz w:val="19"/>
               </w:rPr>
-              <w:t>Developed AST pattern matching for cryptographic primitive identification.</w:t>
+              <w:t>Integrated continuous static analysis into developer workflows to detect cryptographic API misuse rules.</w:t>
             </w:r>
           </w:p>
         </w:tc>
@@ -1001,7 +1001,7 @@
               <w:rPr>
                 <w:sz w:val="19"/>
               </w:rPr>
-              <w:t>Restricted to single-language codebases without multi-layer property graph construction.</w:t>
+              <w:t>Restricted to single-language (Java) rule checking without post-quantum urgency scoring or multi-layer dependency graph triage.</w:t>
             </w:r>
           </w:p>
         </w:tc>
@@ -1027,7 +1027,7 @@
     </w:p>
     <w:p>
       <w:r>
-        <w:t>The proposed AgileGraph architecture operates through five cohesive technical layers:</w:t>
+        <w:t>The proposed AgileGraph architecture operates through six cohesive technical layers:</w:t>
         <w:br/>
         <w:t>1. Comprehensive 7-Scanner Discovery Suite: Executes 7 specialized static scanners mapping directly into the 6 property-graph node categories: (a) Python AST Scanner (hashlib, hmac, cryptography.hazmat, PyCryptodome), (b) Java Scanner (JCA/JCE Cipher, KeyPairGenerator, jjwt, java-jwt), (c) Go Scanner (crypto/*, golang-jwt), (d) Dependency Manifest Scanner (requirements.txt, pom.xml, go.mod with local OSV CVE cache), (e) Certificate &amp; Key Scanner (X.509 RFC 5280 parsing, inline PEM blocks, private keys), (f) Network Endpoint Scanner (service bindings, port configurations, route decorators), and (g) Sensitive Data Scanner (Shannon entropy calculation, secret tokens, private credentials).</w:t>
         <w:br/>
@@ -1037,9 +1037,9 @@
         <w:br/>
         <w:t>4. Mosca Urgency &amp; Triage Matrix: Computes U = (x+y)/z to categorize assets into AT_RISK, URGENT, and SAFE, triaging vulnerabilities into CRITICAL, HIGH, MEDIUM, and LOW priority bands.</w:t>
         <w:br/>
-        <w:t>5. Heterogeneous GATv2 Neural Network: Implements a PyG HeteroGATv2 model to evaluate structural representation learning and cross-codebase risk distillation under Leave-One-Project-Out cross-validation.</w:t>
+        <w:t>5. Heterogeneous GATv2 Neural Network (Representation Distillation): Implements a PyG HeteroGATv2 model trained on weak labels derived from the deterministic heuristic risk engine to evaluate topological representation distillation under Leave-One-Project-Out cross-validation (empirically evaluating weak-label distillation across domain shift rather than claiming independent prediction of unverified real-world cryptanalytic outcomes).</w:t>
         <w:br/>
-        <w:t>6. Presentation &amp; Lifecycle: An interactive React 19/TypeScript web dashboard featuring 2D force-directed graph rendering, Kanban remediation tracking across 6 states, and SHA-256 verifiable audit report export.</w:t>
+        <w:t>6. Presentation &amp; Lifecycle: An interactive React 19/TypeScript web dashboard featuring 2D force-directed graph rendering, a migration roadmap view tracking assets across 6 remediation states, and verifiable audit report exports carrying Git commit SHA and heuristic configuration SHA-256 verification hashes.</w:t>
       </w:r>
     </w:p>
     <w:p>
@@ -1078,11 +1078,11 @@
         <w:br/>
         <w:t>• Libraries: NetworkX 3.2+, PyTorch 2.4+, PyTorch Geometric (PyG) 2.6+, Scikit-Learn, SciPy</w:t>
         <w:br/>
-        <w:t>• Database: SQLite (WAL mode for session security and append-only audit trail)</w:t>
+        <w:t>• Database: SQLite (relational storage for session security and append-only lifecycle audit trail)</w:t>
         <w:br/>
         <w:t>• Security: bcrypt (12 rounds) + PyJWT (HS256) bearer authentication</w:t>
         <w:br/>
-        <w:t>• Packaging: Docker &amp; Docker Compose</w:t>
+        <w:t>• Packaging: Dockerfile (containerized CLI runner)</w:t>
       </w:r>
     </w:p>
     <w:p>
@@ -1122,15 +1122,15 @@
     </w:p>
     <w:p>
       <w:r>
-        <w:t>1. Automated Polyglot 7-Scanner Suite: A deterministic CLI and background worker executing 7 specialized scanners across Python, Java, Go, package manifests, certificates, endpoints, and secrets.</w:t>
+        <w:t>1. Automated Polyglot 7-Scanner Suite: A deterministic CLI and FastAPI REST service executing 7 specialized scanners across Python, Java, Go, package manifests, certificates, endpoints, and secrets.</w:t>
         <w:br/>
         <w:t>2. Interactive Web Dashboard: A full-stack application featuring 2D force-directed graph visualization, inventory ledgers, and Mosca calculators.</w:t>
         <w:br/>
-        <w:t>3. Kanban Remediation Workflow: Lifecycle tracking enabling engineering teams to transition assets from DISCOVERED to DECOMMISSIONED with immutable SQLite audit logs.</w:t>
+        <w:t>3. Migration Roadmap Lifecycle Workflow: Lifecycle tracking enabling engineering teams to transition assets from DISCOVERED to DECOMMISSIONED with an append-only SQLite audit log.</w:t>
         <w:br/>
         <w:t>4. Reproducible LOPO Benchmark Study: Empirical cross-validation across 8 benchmark repositories (520 files) documenting representation distillation.</w:t>
         <w:br/>
-        <w:t>5. Verifiable Audit Exporters: Export of compliance documentation in JSON and Markdown formats with SHA-256 provenance hashes.</w:t>
+        <w:t>5. Verifiable Audit Exporters: Export of compliance documentation in JSON and Markdown formats carrying Git commit SHA and heuristic configuration SHA-256 verification hashes.</w:t>
       </w:r>
     </w:p>
     <w:p>
@@ -1744,7 +1744,7 @@
               <w:rPr>
                 <w:sz w:val="19"/>
               </w:rPr>
-              <w:t>Protected React 19 web dashboard, Kanban lifecycle board, JWT authentication, and CLI reporting.</w:t>
+              <w:t>Protected React 19 web dashboard, Migration Roadmap lifecycle view, JWT authentication, and CLI reporting.</w:t>
             </w:r>
           </w:p>
         </w:tc>
@@ -1842,7 +1842,7 @@
               <w:rPr>
                 <w:sz w:val="19"/>
               </w:rPr>
-              <w:t>System hardening, Docker packaging, comprehensive regression testing, documentation, and final viva defense.</w:t>
+              <w:t>System hardening, Docker container packaging, comprehensive regression testing, documentation, and final viva defense.</w:t>
             </w:r>
           </w:p>
         </w:tc>
@@ -1959,7 +1959,7 @@
         <w:rPr>
           <w:sz w:val="21"/>
         </w:rPr>
-        <w:t>[4] M. Mosca, “Transitioning to Post-Quantum Cryptography: Challenges and Recommendations,” IEEE Security &amp; Privacy, vol. 20, no. 5, pp. 60–66, Sep.–Oct. 2022, doi: 10.1109/MSEC.2022.3188752.</w:t>
+        <w:t>[4] M. Mosca, “Cybersecurity in an Era with Quantum Computers: Will We Be Ready?,” IEEE Security &amp; Privacy, vol. 16, no. 5, pp. 38–41, Sep./Oct. 2018, doi: 10.1109/MSP.2018.3761723. (Also: IACR Cryptology ePrint Archive, Report 2015/1075, 2015).</w:t>
       </w:r>
     </w:p>
     <w:p>
@@ -1983,7 +1983,7 @@
         <w:rPr>
           <w:sz w:val="21"/>
         </w:rPr>
-        <w:t>[6] X. Chen, Y. Zhang, L. Lu, and J. Grundy, “How Do Open-Source Projects Migrate to Post-Quantum Cryptography? An Empirical Study,” ACM Transactions on Software Engineering and Methodology (TOSEM), vol. 33, no. 4, pp. 1–32, Mar. 2024, doi: 10.1145/3638245.</w:t>
+        <w:t>[6] National Institute of Standards and Technology (NIST), “Migration to Post-Quantum Cryptography: Quantum Readiness: Cryptographic Discovery,” NIST Special Publication (SP) 1800-38B, NCCoE, Dec. 2023.</w:t>
       </w:r>
     </w:p>
     <w:p>
@@ -1995,7 +1995,7 @@
         <w:rPr>
           <w:sz w:val="21"/>
         </w:rPr>
-        <w:t>[7] IBM Research, “Cryptographic Bill of Materials (CBOM) Specification: Towards Automated Cryptographic Observability and Agility,” IEEE Software, vol. 40, no. 3, pp. 45–52, May–Jun. 2023.</w:t>
+        <w:t>[7] OWASP Foundation, “Authoritative Specification: Cryptographic Bill of Materials (CBOM),” CycloneDX Specification v1.6, 2024.</w:t>
       </w:r>
     </w:p>
     <w:p>
@@ -2007,7 +2007,7 @@
         <w:rPr>
           <w:sz w:val="21"/>
         </w:rPr>
-        <w:t>[8] K. A. Bernsmed, C. Fritsch, and M. G. Jaatun, “Security and Agility in Practice: An Empirical Survey on Cryptographic Transitions,” in Proc. 8th IEEE Eur. Symp. Secur. Privacy (EuroS&amp;P), Delft, Netherlands, Jul. 2023, pp. 312–326.</w:t>
+        <w:t>[8] M. Egele, D. Brumley, Y. Fratantonio, and C. Kruegel, “An Empirical Study of Cryptographic Misuse in Android Applications,” in Proc. 2013 ACM SIGSAC Conf. Comput. Commun. Secur. (CCS), Berlin, Germany, Nov. 2013, pp. 73–84, doi: 10.1145/2508859.2516693.</w:t>
       </w:r>
     </w:p>
     <w:p>
@@ -2019,7 +2019,7 @@
         <w:rPr>
           <w:sz w:val="21"/>
         </w:rPr>
-        <w:t>[9] R. Kumar, A. Singhal, and P. Liu, “Automated Discovery and Dependency Modeling of Cryptographic APIs in Polyglot Software Systems,” Computers &amp; Security, vol. 128, p. 103140, May 2023, doi: 10.1016/j.cose.2023.103140.</w:t>
+        <w:t>[9] S. Krüger et al., “CogniCrypt: Supporting Developers in using Cryptography,” in Proc. 32nd IEEE/ACM Int. Conf. Automated Softw. Eng. (ASE), Urbana, IL, USA, Nov. 2017, pp. 931–936, doi: 10.1109/ASE.2017.8115707.</w:t>
       </w:r>
     </w:p>
     <w:p>

</xml_diff>

<commit_message>
docs: refine literature survey table, citations, and CBOM definitions per peer-review feedback
</commit_message>
<xml_diff>
--- a/docs/AGILEGRAPH_PROJECT_SYNOPSIS.docx
+++ b/docs/AGILEGRAPH_PROJECT_SYNOPSIS.docx
@@ -221,7 +221,7 @@
     </w:p>
     <w:p>
       <w:r>
-        <w:t>Existing enterprise crypto-inventory mechanisms typically rely on basic static analysis (SAST) linters (e.g., Bandit for Python, SpotBugs/FindSecBugs for Java) or commercial SCA tools (e.g., Snyk, Mend). These tools execute regex-based or token-based searches to flag deprecated algorithm names (such as MD5, SHA-1, or DES). Recently, cryptographic bill of materials (CBOM) standards (e.g., OWASP CycloneDX) have emerged to catalog cryptographic libraries declared in software build manifests.</w:t>
+        <w:t>Existing enterprise crypto-inventory mechanisms typically rely on basic static analysis (SAST) linters (e.g., Bandit for Python, SpotBugs/FindSecBugs for Java) or commercial SCA tools (e.g., Snyk, Mend). These tools execute regex-based or token-based searches to flag deprecated algorithm names (such as MD5, SHA-1, or DES). Recently, cryptographic bill of materials (CBOM) standards (e.g., OWASP CycloneDX) have emerged to catalog cryptographic assets such as algorithms, keys, certificates, and protocols across software components.</w:t>
       </w:r>
     </w:p>
     <w:p>
@@ -239,7 +239,7 @@
     </w:p>
     <w:p>
       <w:r>
-        <w:t>Existing systems fail to model the relational architecture connecting code files to endpoints and libraries. A deprecated cipher buried in an offline test suite is given the same severity rating as the same cipher securing a public API endpoint. Furthermore, none of the current tools incorporate Michele Mosca's post-quantum urgency timeline, making it impossible for engineering teams to prioritize migration based on data retention requirements.</w:t>
+        <w:t>Existing systems fail to model the relational architecture connecting code files to endpoints and libraries. A deprecated cipher buried in an offline test suite is given the same severity rating as the same cipher securing a public API endpoint. Furthermore, most existing tools do not incorporate Michele Mosca's post-quantum urgency timeline, making it difficult for engineering teams to prioritize migration based on data retention requirements.</w:t>
       </w:r>
     </w:p>
     <w:p>
@@ -563,7 +563,7 @@
               <w:rPr>
                 <w:sz w:val="19"/>
               </w:rPr>
-              <w:t>Migration to Post-Quantum Cryptography: Cryptographic Discovery (NIST SP 1800-38B)</w:t>
+              <w:t>Migration to Post-Quantum Cryptography: Cryptographic Discovery (NIST SP 1800-38B, Preliminary Draft)</w:t>
             </w:r>
           </w:p>
         </w:tc>
@@ -685,7 +685,7 @@
               <w:rPr>
                 <w:sz w:val="19"/>
               </w:rPr>
-              <w:t>An Empirical Study of Cryptographic Misuse in Software Applications (ACM CCS)</w:t>
+              <w:t>An Empirical Study of Cryptographic Misuse in Android Applications (ACM CCS)</w:t>
             </w:r>
           </w:p>
         </w:tc>
@@ -733,7 +733,7 @@
               <w:rPr>
                 <w:sz w:val="19"/>
               </w:rPr>
-              <w:t>Demonstrated automated static analysis rules for detecting cryptographic API misuse across software.</w:t>
+              <w:t>Demonstrated automated static analysis rules for detecting cryptographic API misuse across Android applications.</w:t>
             </w:r>
           </w:p>
         </w:tc>
@@ -757,7 +757,7 @@
               <w:rPr>
                 <w:sz w:val="19"/>
               </w:rPr>
-              <w:t>Focuses on classical API misuses without evaluating post-quantum threat horizons or multi-layer property graph dependencies.</w:t>
+              <w:t>Focuses on classical API misuses in Android apps without evaluating post-quantum threat horizons or multi-layer dependency graph properties across enterprise polyglot codebases.</w:t>
             </w:r>
           </w:p>
         </w:tc>
@@ -879,7 +879,7 @@
               <w:rPr>
                 <w:sz w:val="19"/>
               </w:rPr>
-              <w:t>Evaluated only on citation and synthetic benchmark graphs, not on heterogeneous code security dependency graphs.</w:t>
+              <w:t>Evaluated on general graph benchmarks, not on cryptographic risk propagation graphs.</w:t>
             </w:r>
           </w:p>
         </w:tc>
@@ -1983,7 +1983,7 @@
         <w:rPr>
           <w:sz w:val="21"/>
         </w:rPr>
-        <w:t>[6] National Institute of Standards and Technology (NIST), “Migration to Post-Quantum Cryptography: Quantum Readiness: Cryptographic Discovery,” NIST Special Publication (SP) 1800-38B, NCCoE, Dec. 2023.</w:t>
+        <w:t>[6] National Institute of Standards and Technology (NIST), “Migration to Post-Quantum Cryptography: Quantum Readiness: Cryptographic Discovery,” NIST Special Publication (SP) 1800-38B (Preliminary Draft), NCCoE, Dec. 2023.</w:t>
       </w:r>
     </w:p>
     <w:p>
@@ -1995,7 +1995,7 @@
         <w:rPr>
           <w:sz w:val="21"/>
         </w:rPr>
-        <w:t>[7] OWASP Foundation, “Authoritative Specification: Cryptographic Bill of Materials (CBOM),” CycloneDX Specification v1.6, 2024.</w:t>
+        <w:t>[7] OWASP Foundation, “CycloneDX v1.6 Released, Advances Software Supply Chain Security with Cryptographic Bill of Materials and Attestations,” OWASP CycloneDX News, Apr. 2024. [Online]. Available: https://cyclonedx.org/news/cyclonedx-v1.6-released/</w:t>
       </w:r>
     </w:p>
     <w:p>

</xml_diff>